<commit_message>
Elimina el proyecto transversal Escaparate: actividades independientes
Cada actividad tiene ahora su propio escenario ligero y, cuando hace
falta, su propio recurso real y autocontenido (app Flask, SQL, Terraform,
Dockerfile, Lambda) en recursos/temaX/actividad_X_Y/, sin depender de una
aplicación compartida entre sesiones ni de referencias cruzadas con DAW.

- Actividad 3.3 rediseñada por completo (antes ensamblaba 1.1+2.x+3.1+3.2).
- Títulos de actividad corregidos a nombres técnicos, no coloquiales
  (Que se cure solo, Arregla esta red, Diagnosticar a ciegas...).
- Teoría de los 7 temas limpiada de referencias a Escaparate.
- Portada del sitio actualizada, sin la sección del proyecto ni la
  comparación con DAW.
- Las 16 plantillas .docx regeneradas con el contenido nuevo.
</commit_message>
<xml_diff>
--- a/docs/tema1/plantillas/Actividad_1_1_INU_Plantilla.docx
+++ b/docs/tema1/plantillas/Actividad_1_1_INU_Plantilla.docx
@@ -167,7 +167,7 @@
                 <w:sz w:val="20"/>
                 <w:szCs w:val="20"/>
               </w:rPr>
-              <w:t xml:space="preserve">Identificador de recursos usado (ej. escaparate-front-&lt;tu-identificador&gt;): _______________________</w:t>
+              <w:t xml:space="preserve">Identificador de recursos usado (ej. el-manillar-front-&lt;tu-identificador&gt;): _______________________</w:t>
             </w:r>
           </w:p>
           <w:p>
@@ -212,7 +212,7 @@
           <w:sz w:val="26"/>
           <w:szCs w:val="26"/>
         </w:rPr>
-        <w:t xml:space="preserve">Parte A — Publicar el front de Escaparate</w:t>
+        <w:t xml:space="preserve">Parte A — Publicar el front de El Manillar</w:t>
       </w:r>
     </w:p>
     <w:p>
@@ -1025,7 +1025,7 @@
                 <w:sz w:val="20"/>
                 <w:szCs w:val="20"/>
               </w:rPr>
-              <w:t xml:space="preserve">📸 El front de Escaparate cargando desde la URL pública del bucket (actividad_1_1_paso3.png)</w:t>
+              <w:t xml:space="preserve">📸 El front de El Manillar cargando desde la URL pública del bucket (actividad_1_1_paso3.png)</w:t>
             </w:r>
           </w:p>
         </w:tc>

</xml_diff>

<commit_message>
Corrige bugs de Markdown en todo el módulo, añade recursos descargables y reescribe la Actividad 1.1
Arregla numeración de listas rota por imágenes y párrafos Comprueba/Captura sin
separar en todas las actividades; añade descarga de recursos por actividad
(antes solo en carpeta no publicada); añade el Paso 1 de la Actividad 1.1 con
capturas reales del acceso al Learner Lab; rediseña el flujo de CLI del módulo
en torno a AWS CloudShell; reescribe la Parte B de la Actividad 1.1 y quita la
sección de verificación (la corrección es por capturas/plantilla, no por
acceso a las cuentas del alumnado).
</commit_message>
<xml_diff>
--- a/docs/tema1/plantillas/Actividad_1_1_INU_Plantilla.docx
+++ b/docs/tema1/plantillas/Actividad_1_1_INU_Plantilla.docx
@@ -236,21 +236,7 @@
           <w:sz w:val="24"/>
           <w:szCs w:val="24"/>
         </w:rPr>
-        <w:t xml:space="preserve">Paso 1 — Comprueba tu identidad y compara consola y CLI</w:t>
-      </w:r>
-    </w:p>
-    <w:p>
-      <w:pPr>
-        <w:spacing w:after="100"/>
-      </w:pPr>
-      <w:r>
-        <w:rPr>
-          <w:rFonts w:ascii="Arial" w:cs="Arial" w:eastAsia="Arial" w:hAnsi="Arial"/>
-          <w:color w:val="212121"/>
-          <w:sz w:val="22"/>
-          <w:szCs w:val="22"/>
-        </w:rPr>
-        <w:t xml:space="preserve">Anota el Account y el Arn que te devuelve aws sts get-caller-identity:</w:t>
+        <w:t xml:space="preserve">Paso 1 — Entra en tu Learner Lab por primera vez</w:t>
       </w:r>
     </w:p>
     <w:tbl>
@@ -269,8 +255,41 @@
         <w:gridCol w:w="9638"/>
       </w:tblGrid>
       <w:tr>
-        <w:trPr>
-          <w:trHeight w:val="480"/>
+        <w:tc>
+          <w:tcPr>
+            <w:tcW w:type="dxa" w:w="9638"/>
+            <w:tcBorders>
+              <w:top w:val="none" w:color="FFFFFF" w:sz="0"/>
+              <w:left w:val="none" w:color="FFFFFF" w:sz="0"/>
+              <w:bottom w:val="none" w:color="FFFFFF" w:sz="0"/>
+              <w:right w:val="none" w:color="FFFFFF" w:sz="0"/>
+            </w:tcBorders>
+            <w:shd w:fill="3949AB" w:val="clear"/>
+            <w:tcMar>
+              <w:top w:type="dxa" w:w="80"/>
+              <w:left w:type="dxa" w:w="160"/>
+              <w:bottom w:type="dxa" w:w="80"/>
+              <w:right w:type="dxa" w:w="160"/>
+            </w:tcMar>
+          </w:tcPr>
+          <w:p>
+            <w:r>
+              <w:rPr>
+                <w:rFonts w:ascii="Arial" w:cs="Arial" w:eastAsia="Arial" w:hAnsi="Arial"/>
+                <w:b/>
+                <w:bCs/>
+                <w:color w:val="FFFFFF"/>
+                <w:sz w:val="20"/>
+                <w:szCs w:val="20"/>
+              </w:rPr>
+              <w:t xml:space="preserve">📸 La página de inicio de tu propia Consola de AWS, con tu usuario (voclabs/user...) visible arriba a la derecha</w:t>
+            </w:r>
+          </w:p>
+        </w:tc>
+      </w:tr>
+      <w:tr>
+        <w:trPr>
+          <w:trHeight w:val="2400"/>
         </w:trPr>
         <w:tc>
           <w:tcPr>
@@ -283,51 +302,26 @@
             </w:tcBorders>
             <w:shd w:fill="FAFAFA" w:val="clear"/>
             <w:tcMar>
-              <w:top w:type="dxa" w:w="60"/>
-              <w:left w:type="dxa" w:w="160"/>
-              <w:bottom w:type="dxa" w:w="60"/>
-              <w:right w:type="dxa" w:w="160"/>
-            </w:tcMar>
-          </w:tcPr>
-          <w:p>
-            <w:r>
-              <w:rPr>
-                <w:sz w:val="22"/>
-                <w:szCs w:val="22"/>
-              </w:rPr>
-              <w:t xml:space="preserve"/>
-            </w:r>
-          </w:p>
-        </w:tc>
-      </w:tr>
-      <w:tr>
-        <w:trPr>
-          <w:trHeight w:val="480"/>
-        </w:trPr>
-        <w:tc>
-          <w:tcPr>
-            <w:tcW w:type="dxa" w:w="9638"/>
-            <w:tcBorders>
-              <w:top w:val="single" w:color="E0E0E0" w:sz="4"/>
-              <w:left w:val="single" w:color="E0E0E0" w:sz="4"/>
-              <w:bottom w:val="single" w:color="E0E0E0" w:sz="4"/>
-              <w:right w:val="single" w:color="E0E0E0" w:sz="4"/>
-            </w:tcBorders>
-            <w:shd w:fill="FAFAFA" w:val="clear"/>
-            <w:tcMar>
-              <w:top w:type="dxa" w:w="60"/>
-              <w:left w:type="dxa" w:w="160"/>
-              <w:bottom w:type="dxa" w:w="60"/>
-              <w:right w:type="dxa" w:w="160"/>
-            </w:tcMar>
-          </w:tcPr>
-          <w:p>
-            <w:r>
-              <w:rPr>
-                <w:sz w:val="22"/>
-                <w:szCs w:val="22"/>
-              </w:rPr>
-              <w:t xml:space="preserve"/>
+              <w:top w:type="dxa" w:w="80"/>
+              <w:left w:type="dxa" w:w="160"/>
+              <w:bottom w:type="dxa" w:w="80"/>
+              <w:right w:type="dxa" w:w="160"/>
+            </w:tcMar>
+          </w:tcPr>
+          <w:p>
+            <w:pPr>
+              <w:jc w:val="center"/>
+            </w:pPr>
+            <w:r>
+              <w:rPr>
+                <w:rFonts w:ascii="Arial" w:cs="Arial" w:eastAsia="Arial" w:hAnsi="Arial"/>
+                <w:i/>
+                <w:iCs/>
+                <w:color w:val="757575"/>
+                <w:sz w:val="20"/>
+                <w:szCs w:val="20"/>
+              </w:rPr>
+              <w:t xml:space="preserve">[Pega aquí la captura de pantalla]</w:t>
             </w:r>
           </w:p>
         </w:tc>
@@ -335,8 +329,46 @@
     </w:tbl>
     <w:p>
       <w:pPr>
-        <w:spacing w:after="120"/>
-      </w:pPr>
+        <w:spacing w:after="200"/>
+      </w:pPr>
+    </w:p>
+    <w:p>
+      <w:r>
+        <w:br w:type="page"/>
+      </w:r>
+    </w:p>
+    <w:p>
+      <w:pPr>
+        <w:pBdr>
+          <w:bottom w:val="single" w:color="FFA000" w:sz="4" w:space="1"/>
+        </w:pBdr>
+        <w:spacing w:after="120" w:before="240"/>
+      </w:pPr>
+      <w:r>
+        <w:rPr>
+          <w:rFonts w:ascii="Arial" w:cs="Arial" w:eastAsia="Arial" w:hAnsi="Arial"/>
+          <w:b/>
+          <w:bCs/>
+          <w:color w:val="3949AB"/>
+          <w:sz w:val="24"/>
+          <w:szCs w:val="24"/>
+        </w:rPr>
+        <w:t xml:space="preserve">Paso 2 — Comprueba tu identidad y compara consola y CLI</w:t>
+      </w:r>
+    </w:p>
+    <w:p>
+      <w:pPr>
+        <w:spacing w:after="100"/>
+      </w:pPr>
+      <w:r>
+        <w:rPr>
+          <w:rFonts w:ascii="Arial" w:cs="Arial" w:eastAsia="Arial" w:hAnsi="Arial"/>
+          <w:color w:val="212121"/>
+          <w:sz w:val="22"/>
+          <w:szCs w:val="22"/>
+        </w:rPr>
+        <w:t xml:space="preserve">Anota el Account y el Arn que te devuelve aws sts get-caller-identity:</w:t>
+      </w:r>
     </w:p>
     <w:tbl>
       <w:tblPr>
@@ -354,41 +386,8 @@
         <w:gridCol w:w="9638"/>
       </w:tblGrid>
       <w:tr>
-        <w:tc>
-          <w:tcPr>
-            <w:tcW w:type="dxa" w:w="9638"/>
-            <w:tcBorders>
-              <w:top w:val="none" w:color="FFFFFF" w:sz="0"/>
-              <w:left w:val="none" w:color="FFFFFF" w:sz="0"/>
-              <w:bottom w:val="none" w:color="FFFFFF" w:sz="0"/>
-              <w:right w:val="none" w:color="FFFFFF" w:sz="0"/>
-            </w:tcBorders>
-            <w:shd w:fill="3949AB" w:val="clear"/>
-            <w:tcMar>
-              <w:top w:type="dxa" w:w="80"/>
-              <w:left w:type="dxa" w:w="160"/>
-              <w:bottom w:type="dxa" w:w="80"/>
-              <w:right w:type="dxa" w:w="160"/>
-            </w:tcMar>
-          </w:tcPr>
-          <w:p>
-            <w:r>
-              <w:rPr>
-                <w:rFonts w:ascii="Arial" w:cs="Arial" w:eastAsia="Arial" w:hAnsi="Arial"/>
-                <w:b/>
-                <w:bCs/>
-                <w:color w:val="FFFFFF"/>
-                <w:sz w:val="20"/>
-                <w:szCs w:val="20"/>
-              </w:rPr>
-              <w:t xml:space="preserve">📸 Menú de identidad en la consola, con el número de cuenta visible (actividad_1_1_paso1.png)</w:t>
-            </w:r>
-          </w:p>
-        </w:tc>
-      </w:tr>
-      <w:tr>
-        <w:trPr>
-          <w:trHeight w:val="2400"/>
+        <w:trPr>
+          <w:trHeight w:val="480"/>
         </w:trPr>
         <w:tc>
           <w:tcPr>
@@ -401,26 +400,51 @@
             </w:tcBorders>
             <w:shd w:fill="FAFAFA" w:val="clear"/>
             <w:tcMar>
-              <w:top w:type="dxa" w:w="80"/>
-              <w:left w:type="dxa" w:w="160"/>
-              <w:bottom w:type="dxa" w:w="80"/>
-              <w:right w:type="dxa" w:w="160"/>
-            </w:tcMar>
-          </w:tcPr>
-          <w:p>
-            <w:pPr>
-              <w:jc w:val="center"/>
-            </w:pPr>
-            <w:r>
-              <w:rPr>
-                <w:rFonts w:ascii="Arial" w:cs="Arial" w:eastAsia="Arial" w:hAnsi="Arial"/>
-                <w:i/>
-                <w:iCs/>
-                <w:color w:val="757575"/>
-                <w:sz w:val="20"/>
-                <w:szCs w:val="20"/>
-              </w:rPr>
-              <w:t xml:space="preserve">[Pega aquí la captura de pantalla]</w:t>
+              <w:top w:type="dxa" w:w="60"/>
+              <w:left w:type="dxa" w:w="160"/>
+              <w:bottom w:type="dxa" w:w="60"/>
+              <w:right w:type="dxa" w:w="160"/>
+            </w:tcMar>
+          </w:tcPr>
+          <w:p>
+            <w:r>
+              <w:rPr>
+                <w:sz w:val="22"/>
+                <w:szCs w:val="22"/>
+              </w:rPr>
+              <w:t xml:space="preserve"/>
+            </w:r>
+          </w:p>
+        </w:tc>
+      </w:tr>
+      <w:tr>
+        <w:trPr>
+          <w:trHeight w:val="480"/>
+        </w:trPr>
+        <w:tc>
+          <w:tcPr>
+            <w:tcW w:type="dxa" w:w="9638"/>
+            <w:tcBorders>
+              <w:top w:val="single" w:color="E0E0E0" w:sz="4"/>
+              <w:left w:val="single" w:color="E0E0E0" w:sz="4"/>
+              <w:bottom w:val="single" w:color="E0E0E0" w:sz="4"/>
+              <w:right w:val="single" w:color="E0E0E0" w:sz="4"/>
+            </w:tcBorders>
+            <w:shd w:fill="FAFAFA" w:val="clear"/>
+            <w:tcMar>
+              <w:top w:type="dxa" w:w="60"/>
+              <w:left w:type="dxa" w:w="160"/>
+              <w:bottom w:type="dxa" w:w="60"/>
+              <w:right w:type="dxa" w:w="160"/>
+            </w:tcMar>
+          </w:tcPr>
+          <w:p>
+            <w:r>
+              <w:rPr>
+                <w:sz w:val="22"/>
+                <w:szCs w:val="22"/>
+              </w:rPr>
+              <w:t xml:space="preserve"/>
             </w:r>
           </w:p>
         </w:tc>
@@ -474,7 +498,7 @@
                 <w:sz w:val="20"/>
                 <w:szCs w:val="20"/>
               </w:rPr>
-              <w:t xml:space="preserve">📸 Salida de aws sts get-caller-identity en tu terminal</w:t>
+              <w:t xml:space="preserve">📸 Tu propio menú de identidad en la consola, con tu número de cuenta visible</w:t>
             </w:r>
           </w:p>
         </w:tc>
@@ -521,32 +545,8 @@
     </w:tbl>
     <w:p>
       <w:pPr>
-        <w:spacing w:after="200"/>
-      </w:pPr>
-    </w:p>
-    <w:p>
-      <w:r>
-        <w:br w:type="page"/>
-      </w:r>
-    </w:p>
-    <w:p>
-      <w:pPr>
-        <w:pBdr>
-          <w:bottom w:val="single" w:color="FFA000" w:sz="4" w:space="1"/>
-        </w:pBdr>
-        <w:spacing w:after="120" w:before="240"/>
-      </w:pPr>
-      <w:r>
-        <w:rPr>
-          <w:rFonts w:ascii="Arial" w:cs="Arial" w:eastAsia="Arial" w:hAnsi="Arial"/>
-          <w:b/>
-          <w:bCs/>
-          <w:color w:val="3949AB"/>
-          <w:sz w:val="24"/>
-          <w:szCs w:val="24"/>
-        </w:rPr>
-        <w:t xml:space="preserve">Paso 2 — Crea y configura el bucket desde la consola</w:t>
-      </w:r>
+        <w:spacing w:after="120"/>
+      </w:pPr>
     </w:p>
     <w:tbl>
       <w:tblPr>
@@ -591,7 +591,7 @@
                 <w:sz w:val="20"/>
                 <w:szCs w:val="20"/>
               </w:rPr>
-              <w:t xml:space="preserve">📸 Pantalla de creación del bucket, con el bloqueo de acceso público desmarcado (actividad_1_1_paso2_a.png)</w:t>
+              <w:t xml:space="preserve">📸 Salida de aws sts get-caller-identity en tu terminal</w:t>
             </w:r>
           </w:p>
         </w:tc>
@@ -638,8 +638,32 @@
     </w:tbl>
     <w:p>
       <w:pPr>
-        <w:spacing w:after="120"/>
-      </w:pPr>
+        <w:spacing w:after="200"/>
+      </w:pPr>
+    </w:p>
+    <w:p>
+      <w:r>
+        <w:br w:type="page"/>
+      </w:r>
+    </w:p>
+    <w:p>
+      <w:pPr>
+        <w:pBdr>
+          <w:bottom w:val="single" w:color="FFA000" w:sz="4" w:space="1"/>
+        </w:pBdr>
+        <w:spacing w:after="120" w:before="240"/>
+      </w:pPr>
+      <w:r>
+        <w:rPr>
+          <w:rFonts w:ascii="Arial" w:cs="Arial" w:eastAsia="Arial" w:hAnsi="Arial"/>
+          <w:b/>
+          <w:bCs/>
+          <w:color w:val="3949AB"/>
+          <w:sz w:val="24"/>
+          <w:szCs w:val="24"/>
+        </w:rPr>
+        <w:t xml:space="preserve">Paso 3 — Crea y configura el bucket desde la consola</w:t>
+      </w:r>
     </w:p>
     <w:tbl>
       <w:tblPr>
@@ -684,7 +708,7 @@
                 <w:sz w:val="20"/>
                 <w:szCs w:val="20"/>
               </w:rPr>
-              <w:t xml:space="preserve">📸 Configuración de alojamiento de sitio web estático activada (actividad_1_1_paso2_b.png)</w:t>
+              <w:t xml:space="preserve">📸 Pantalla de creación con el bloqueo desmarcado, con el nombre de tu bucket visible en el campo</w:t>
             </w:r>
           </w:p>
         </w:tc>
@@ -777,7 +801,7 @@
                 <w:sz w:val="20"/>
                 <w:szCs w:val="20"/>
               </w:rPr>
-              <w:t xml:space="preserve">📸 Política de bucket con lectura pública configurada (actividad_1_1_paso2_c.png)</w:t>
+              <w:t xml:space="preserve">📸 Alojamiento estático activado, con el nombre de tu bucket visible en la ruta de navegación superior</w:t>
             </w:r>
           </w:p>
         </w:tc>
@@ -826,20 +850,6 @@
       <w:pPr>
         <w:spacing w:after="120"/>
       </w:pPr>
-    </w:p>
-    <w:p>
-      <w:pPr>
-        <w:spacing w:after="100"/>
-      </w:pPr>
-      <w:r>
-        <w:rPr>
-          <w:rFonts w:ascii="Arial" w:cs="Arial" w:eastAsia="Arial" w:hAnsi="Arial"/>
-          <w:color w:val="212121"/>
-          <w:sz w:val="22"/>
-          <w:szCs w:val="22"/>
-        </w:rPr>
-        <w:t xml:space="preserve">Documenta tu elección: qué nombre e identificador de bucket has elegido y por qué.</w:t>
-      </w:r>
     </w:p>
     <w:tbl>
       <w:tblPr>
@@ -857,8 +867,41 @@
         <w:gridCol w:w="9638"/>
       </w:tblGrid>
       <w:tr>
-        <w:trPr>
-          <w:trHeight w:val="480"/>
+        <w:tc>
+          <w:tcPr>
+            <w:tcW w:type="dxa" w:w="9638"/>
+            <w:tcBorders>
+              <w:top w:val="none" w:color="FFFFFF" w:sz="0"/>
+              <w:left w:val="none" w:color="FFFFFF" w:sz="0"/>
+              <w:bottom w:val="none" w:color="FFFFFF" w:sz="0"/>
+              <w:right w:val="none" w:color="FFFFFF" w:sz="0"/>
+            </w:tcBorders>
+            <w:shd w:fill="3949AB" w:val="clear"/>
+            <w:tcMar>
+              <w:top w:type="dxa" w:w="80"/>
+              <w:left w:type="dxa" w:w="160"/>
+              <w:bottom w:type="dxa" w:w="80"/>
+              <w:right w:type="dxa" w:w="160"/>
+            </w:tcMar>
+          </w:tcPr>
+          <w:p>
+            <w:r>
+              <w:rPr>
+                <w:rFonts w:ascii="Arial" w:cs="Arial" w:eastAsia="Arial" w:hAnsi="Arial"/>
+                <w:b/>
+                <w:bCs/>
+                <w:color w:val="FFFFFF"/>
+                <w:sz w:val="20"/>
+                <w:szCs w:val="20"/>
+              </w:rPr>
+              <w:t xml:space="preserve">📸 Política de bucket, con el Resource mostrando el ARN de tu propio bucket</w:t>
+            </w:r>
+          </w:p>
+        </w:tc>
+      </w:tr>
+      <w:tr>
+        <w:trPr>
+          <w:trHeight w:val="2400"/>
         </w:trPr>
         <w:tc>
           <w:tcPr>
@@ -871,83 +914,26 @@
             </w:tcBorders>
             <w:shd w:fill="FAFAFA" w:val="clear"/>
             <w:tcMar>
-              <w:top w:type="dxa" w:w="60"/>
-              <w:left w:type="dxa" w:w="160"/>
-              <w:bottom w:type="dxa" w:w="60"/>
-              <w:right w:type="dxa" w:w="160"/>
-            </w:tcMar>
-          </w:tcPr>
-          <w:p>
-            <w:r>
-              <w:rPr>
-                <w:sz w:val="22"/>
-                <w:szCs w:val="22"/>
-              </w:rPr>
-              <w:t xml:space="preserve"/>
-            </w:r>
-          </w:p>
-        </w:tc>
-      </w:tr>
-      <w:tr>
-        <w:trPr>
-          <w:trHeight w:val="480"/>
-        </w:trPr>
-        <w:tc>
-          <w:tcPr>
-            <w:tcW w:type="dxa" w:w="9638"/>
-            <w:tcBorders>
-              <w:top w:val="single" w:color="E0E0E0" w:sz="4"/>
-              <w:left w:val="single" w:color="E0E0E0" w:sz="4"/>
-              <w:bottom w:val="single" w:color="E0E0E0" w:sz="4"/>
-              <w:right w:val="single" w:color="E0E0E0" w:sz="4"/>
-            </w:tcBorders>
-            <w:shd w:fill="FAFAFA" w:val="clear"/>
-            <w:tcMar>
-              <w:top w:type="dxa" w:w="60"/>
-              <w:left w:type="dxa" w:w="160"/>
-              <w:bottom w:type="dxa" w:w="60"/>
-              <w:right w:type="dxa" w:w="160"/>
-            </w:tcMar>
-          </w:tcPr>
-          <w:p>
-            <w:r>
-              <w:rPr>
-                <w:sz w:val="22"/>
-                <w:szCs w:val="22"/>
-              </w:rPr>
-              <w:t xml:space="preserve"/>
-            </w:r>
-          </w:p>
-        </w:tc>
-      </w:tr>
-      <w:tr>
-        <w:trPr>
-          <w:trHeight w:val="480"/>
-        </w:trPr>
-        <w:tc>
-          <w:tcPr>
-            <w:tcW w:type="dxa" w:w="9638"/>
-            <w:tcBorders>
-              <w:top w:val="single" w:color="E0E0E0" w:sz="4"/>
-              <w:left w:val="single" w:color="E0E0E0" w:sz="4"/>
-              <w:bottom w:val="single" w:color="E0E0E0" w:sz="4"/>
-              <w:right w:val="single" w:color="E0E0E0" w:sz="4"/>
-            </w:tcBorders>
-            <w:shd w:fill="FAFAFA" w:val="clear"/>
-            <w:tcMar>
-              <w:top w:type="dxa" w:w="60"/>
-              <w:left w:type="dxa" w:w="160"/>
-              <w:bottom w:type="dxa" w:w="60"/>
-              <w:right w:type="dxa" w:w="160"/>
-            </w:tcMar>
-          </w:tcPr>
-          <w:p>
-            <w:r>
-              <w:rPr>
-                <w:sz w:val="22"/>
-                <w:szCs w:val="22"/>
-              </w:rPr>
-              <w:t xml:space="preserve"/>
+              <w:top w:type="dxa" w:w="80"/>
+              <w:left w:type="dxa" w:w="160"/>
+              <w:bottom w:type="dxa" w:w="80"/>
+              <w:right w:type="dxa" w:w="160"/>
+            </w:tcMar>
+          </w:tcPr>
+          <w:p>
+            <w:pPr>
+              <w:jc w:val="center"/>
+            </w:pPr>
+            <w:r>
+              <w:rPr>
+                <w:rFonts w:ascii="Arial" w:cs="Arial" w:eastAsia="Arial" w:hAnsi="Arial"/>
+                <w:i/>
+                <w:iCs/>
+                <w:color w:val="757575"/>
+                <w:sz w:val="20"/>
+                <w:szCs w:val="20"/>
+              </w:rPr>
+              <w:t xml:space="preserve">[Pega aquí la captura de pantalla]</w:t>
             </w:r>
           </w:p>
         </w:tc>
@@ -955,31 +941,21 @@
     </w:tbl>
     <w:p>
       <w:pPr>
-        <w:spacing w:after="200"/>
-      </w:pPr>
-    </w:p>
-    <w:p>
-      <w:r>
-        <w:br w:type="page"/>
-      </w:r>
-    </w:p>
-    <w:p>
-      <w:pPr>
-        <w:pBdr>
-          <w:bottom w:val="single" w:color="FFA000" w:sz="4" w:space="1"/>
-        </w:pBdr>
-        <w:spacing w:after="120" w:before="240"/>
+        <w:spacing w:after="120"/>
+      </w:pPr>
+    </w:p>
+    <w:p>
+      <w:pPr>
+        <w:spacing w:after="100"/>
       </w:pPr>
       <w:r>
         <w:rPr>
           <w:rFonts w:ascii="Arial" w:cs="Arial" w:eastAsia="Arial" w:hAnsi="Arial"/>
-          <w:b/>
-          <w:bCs/>
-          <w:color w:val="3949AB"/>
-          <w:sz w:val="24"/>
-          <w:szCs w:val="24"/>
+          <w:color w:val="212121"/>
+          <w:sz w:val="22"/>
+          <w:szCs w:val="22"/>
         </w:rPr>
-        <w:t xml:space="preserve">Paso 3 — Sube el contenido por CLI y verifica</w:t>
+        <w:t xml:space="preserve">Documenta tu elección: qué nombre e identificador de bucket has elegido y por qué.</w:t>
       </w:r>
     </w:p>
     <w:tbl>
@@ -998,41 +974,8 @@
         <w:gridCol w:w="9638"/>
       </w:tblGrid>
       <w:tr>
-        <w:tc>
-          <w:tcPr>
-            <w:tcW w:type="dxa" w:w="9638"/>
-            <w:tcBorders>
-              <w:top w:val="none" w:color="FFFFFF" w:sz="0"/>
-              <w:left w:val="none" w:color="FFFFFF" w:sz="0"/>
-              <w:bottom w:val="none" w:color="FFFFFF" w:sz="0"/>
-              <w:right w:val="none" w:color="FFFFFF" w:sz="0"/>
-            </w:tcBorders>
-            <w:shd w:fill="3949AB" w:val="clear"/>
-            <w:tcMar>
-              <w:top w:type="dxa" w:w="80"/>
-              <w:left w:type="dxa" w:w="160"/>
-              <w:bottom w:type="dxa" w:w="80"/>
-              <w:right w:type="dxa" w:w="160"/>
-            </w:tcMar>
-          </w:tcPr>
-          <w:p>
-            <w:r>
-              <w:rPr>
-                <w:rFonts w:ascii="Arial" w:cs="Arial" w:eastAsia="Arial" w:hAnsi="Arial"/>
-                <w:b/>
-                <w:bCs/>
-                <w:color w:val="FFFFFF"/>
-                <w:sz w:val="20"/>
-                <w:szCs w:val="20"/>
-              </w:rPr>
-              <w:t xml:space="preserve">📸 El front de El Manillar cargando desde la URL pública del bucket (actividad_1_1_paso3.png)</w:t>
-            </w:r>
-          </w:p>
-        </w:tc>
-      </w:tr>
-      <w:tr>
-        <w:trPr>
-          <w:trHeight w:val="2400"/>
+        <w:trPr>
+          <w:trHeight w:val="480"/>
         </w:trPr>
         <w:tc>
           <w:tcPr>
@@ -1045,26 +988,83 @@
             </w:tcBorders>
             <w:shd w:fill="FAFAFA" w:val="clear"/>
             <w:tcMar>
-              <w:top w:type="dxa" w:w="80"/>
-              <w:left w:type="dxa" w:w="160"/>
-              <w:bottom w:type="dxa" w:w="80"/>
-              <w:right w:type="dxa" w:w="160"/>
-            </w:tcMar>
-          </w:tcPr>
-          <w:p>
-            <w:pPr>
-              <w:jc w:val="center"/>
-            </w:pPr>
-            <w:r>
-              <w:rPr>
-                <w:rFonts w:ascii="Arial" w:cs="Arial" w:eastAsia="Arial" w:hAnsi="Arial"/>
-                <w:i/>
-                <w:iCs/>
-                <w:color w:val="757575"/>
-                <w:sz w:val="20"/>
-                <w:szCs w:val="20"/>
-              </w:rPr>
-              <w:t xml:space="preserve">[Pega aquí la captura de pantalla]</w:t>
+              <w:top w:type="dxa" w:w="60"/>
+              <w:left w:type="dxa" w:w="160"/>
+              <w:bottom w:type="dxa" w:w="60"/>
+              <w:right w:type="dxa" w:w="160"/>
+            </w:tcMar>
+          </w:tcPr>
+          <w:p>
+            <w:r>
+              <w:rPr>
+                <w:sz w:val="22"/>
+                <w:szCs w:val="22"/>
+              </w:rPr>
+              <w:t xml:space="preserve"/>
+            </w:r>
+          </w:p>
+        </w:tc>
+      </w:tr>
+      <w:tr>
+        <w:trPr>
+          <w:trHeight w:val="480"/>
+        </w:trPr>
+        <w:tc>
+          <w:tcPr>
+            <w:tcW w:type="dxa" w:w="9638"/>
+            <w:tcBorders>
+              <w:top w:val="single" w:color="E0E0E0" w:sz="4"/>
+              <w:left w:val="single" w:color="E0E0E0" w:sz="4"/>
+              <w:bottom w:val="single" w:color="E0E0E0" w:sz="4"/>
+              <w:right w:val="single" w:color="E0E0E0" w:sz="4"/>
+            </w:tcBorders>
+            <w:shd w:fill="FAFAFA" w:val="clear"/>
+            <w:tcMar>
+              <w:top w:type="dxa" w:w="60"/>
+              <w:left w:type="dxa" w:w="160"/>
+              <w:bottom w:type="dxa" w:w="60"/>
+              <w:right w:type="dxa" w:w="160"/>
+            </w:tcMar>
+          </w:tcPr>
+          <w:p>
+            <w:r>
+              <w:rPr>
+                <w:sz w:val="22"/>
+                <w:szCs w:val="22"/>
+              </w:rPr>
+              <w:t xml:space="preserve"/>
+            </w:r>
+          </w:p>
+        </w:tc>
+      </w:tr>
+      <w:tr>
+        <w:trPr>
+          <w:trHeight w:val="480"/>
+        </w:trPr>
+        <w:tc>
+          <w:tcPr>
+            <w:tcW w:type="dxa" w:w="9638"/>
+            <w:tcBorders>
+              <w:top w:val="single" w:color="E0E0E0" w:sz="4"/>
+              <w:left w:val="single" w:color="E0E0E0" w:sz="4"/>
+              <w:bottom w:val="single" w:color="E0E0E0" w:sz="4"/>
+              <w:right w:val="single" w:color="E0E0E0" w:sz="4"/>
+            </w:tcBorders>
+            <w:shd w:fill="FAFAFA" w:val="clear"/>
+            <w:tcMar>
+              <w:top w:type="dxa" w:w="60"/>
+              <w:left w:type="dxa" w:w="160"/>
+              <w:bottom w:type="dxa" w:w="60"/>
+              <w:right w:type="dxa" w:w="160"/>
+            </w:tcMar>
+          </w:tcPr>
+          <w:p>
+            <w:r>
+              <w:rPr>
+                <w:sz w:val="22"/>
+                <w:szCs w:val="22"/>
+              </w:rPr>
+              <w:t xml:space="preserve"/>
             </w:r>
           </w:p>
         </w:tc>
@@ -1072,8 +1072,32 @@
     </w:tbl>
     <w:p>
       <w:pPr>
-        <w:spacing w:after="120"/>
-      </w:pPr>
+        <w:spacing w:after="200"/>
+      </w:pPr>
+    </w:p>
+    <w:p>
+      <w:r>
+        <w:br w:type="page"/>
+      </w:r>
+    </w:p>
+    <w:p>
+      <w:pPr>
+        <w:pBdr>
+          <w:bottom w:val="single" w:color="FFA000" w:sz="4" w:space="1"/>
+        </w:pBdr>
+        <w:spacing w:after="120" w:before="240"/>
+      </w:pPr>
+      <w:r>
+        <w:rPr>
+          <w:rFonts w:ascii="Arial" w:cs="Arial" w:eastAsia="Arial" w:hAnsi="Arial"/>
+          <w:b/>
+          <w:bCs/>
+          <w:color w:val="3949AB"/>
+          <w:sz w:val="24"/>
+          <w:szCs w:val="24"/>
+        </w:rPr>
+        <w:t xml:space="preserve">Paso 4 — Sube el contenido por CLI y verifica</w:t>
+      </w:r>
     </w:p>
     <w:tbl>
       <w:tblPr>
@@ -1118,7 +1142,7 @@
                 <w:sz w:val="20"/>
                 <w:szCs w:val="20"/>
               </w:rPr>
-              <w:t xml:space="preserve">📸 Salida del comando aws s3 cp mostrando los ficheros subidos</w:t>
+              <w:t xml:space="preserve">📸 El front de El Manillar cargando, sin recortar la barra de direcciones (se ve el nombre de tu bucket en la URL)</w:t>
             </w:r>
           </w:p>
         </w:tc>
@@ -1165,27 +1189,8 @@
     </w:tbl>
     <w:p>
       <w:pPr>
-        <w:spacing w:after="200"/>
-      </w:pPr>
-    </w:p>
-    <w:p>
-      <w:pPr>
-        <w:pBdr>
-          <w:bottom w:val="single" w:color="FFA000" w:sz="4" w:space="1"/>
-        </w:pBdr>
-        <w:spacing w:after="120" w:before="240"/>
-      </w:pPr>
-      <w:r>
-        <w:rPr>
-          <w:rFonts w:ascii="Arial" w:cs="Arial" w:eastAsia="Arial" w:hAnsi="Arial"/>
-          <w:b/>
-          <w:bCs/>
-          <w:color w:val="3949AB"/>
-          <w:sz w:val="24"/>
-          <w:szCs w:val="24"/>
-        </w:rPr>
-        <w:t xml:space="preserve">Paso 4 — Localiza dónde se controla el gasto de tu laboratorio</w:t>
-      </w:r>
+        <w:spacing w:after="120"/>
+      </w:pPr>
     </w:p>
     <w:tbl>
       <w:tblPr>
@@ -1230,7 +1235,7 @@
                 <w:sz w:val="20"/>
                 <w:szCs w:val="20"/>
               </w:rPr>
-              <w:t xml:space="preserve">📸 Presupuesto con alerta configurado, o panel de crédito del Learner Lab (actividad_1_1_paso4.png)</w:t>
+              <w:t xml:space="preserve">📸 Salida de aws s3 cp con la ruta s3://&lt;tu-bucket&gt;/ completa</w:t>
             </w:r>
           </w:p>
         </w:tc>
@@ -1277,21 +1282,26 @@
     </w:tbl>
     <w:p>
       <w:pPr>
-        <w:spacing w:after="120"/>
-      </w:pPr>
-    </w:p>
-    <w:p>
-      <w:pPr>
-        <w:spacing w:after="100"/>
+        <w:spacing w:after="200"/>
+      </w:pPr>
+    </w:p>
+    <w:p>
+      <w:pPr>
+        <w:pBdr>
+          <w:bottom w:val="single" w:color="FFA000" w:sz="4" w:space="1"/>
+        </w:pBdr>
+        <w:spacing w:after="120" w:before="240"/>
       </w:pPr>
       <w:r>
         <w:rPr>
           <w:rFonts w:ascii="Arial" w:cs="Arial" w:eastAsia="Arial" w:hAnsi="Arial"/>
-          <w:color w:val="212121"/>
-          <w:sz w:val="22"/>
-          <w:szCs w:val="22"/>
+          <w:b/>
+          <w:bCs/>
+          <w:color w:val="3949AB"/>
+          <w:sz w:val="24"/>
+          <w:szCs w:val="24"/>
         </w:rPr>
-        <w:t xml:space="preserve">Anota dónde vas a consultar el gasto real de tu laboratorio al terminar cada sesión:</w:t>
+        <w:t xml:space="preserve">Paso 5 — Localiza dónde se controla el gasto de tu laboratorio</w:t>
       </w:r>
     </w:p>
     <w:tbl>
@@ -1310,8 +1320,41 @@
         <w:gridCol w:w="9638"/>
       </w:tblGrid>
       <w:tr>
-        <w:trPr>
-          <w:trHeight w:val="480"/>
+        <w:tc>
+          <w:tcPr>
+            <w:tcW w:type="dxa" w:w="9638"/>
+            <w:tcBorders>
+              <w:top w:val="none" w:color="FFFFFF" w:sz="0"/>
+              <w:left w:val="none" w:color="FFFFFF" w:sz="0"/>
+              <w:bottom w:val="none" w:color="FFFFFF" w:sz="0"/>
+              <w:right w:val="none" w:color="FFFFFF" w:sz="0"/>
+            </w:tcBorders>
+            <w:shd w:fill="3949AB" w:val="clear"/>
+            <w:tcMar>
+              <w:top w:type="dxa" w:w="80"/>
+              <w:left w:type="dxa" w:w="160"/>
+              <w:bottom w:type="dxa" w:w="80"/>
+              <w:right w:type="dxa" w:w="160"/>
+            </w:tcMar>
+          </w:tcPr>
+          <w:p>
+            <w:r>
+              <w:rPr>
+                <w:rFonts w:ascii="Arial" w:cs="Arial" w:eastAsia="Arial" w:hAnsi="Arial"/>
+                <w:b/>
+                <w:bCs/>
+                <w:color w:val="FFFFFF"/>
+                <w:sz w:val="20"/>
+                <w:szCs w:val="20"/>
+              </w:rPr>
+              <w:t xml:space="preserve">📸 Tu presupuesto o el panel de crédito, con tu número de cuenta o el nombre de tu laboratorio visible</w:t>
+            </w:r>
+          </w:p>
+        </w:tc>
+      </w:tr>
+      <w:tr>
+        <w:trPr>
+          <w:trHeight w:val="2400"/>
         </w:trPr>
         <w:tc>
           <w:tcPr>
@@ -1324,51 +1367,26 @@
             </w:tcBorders>
             <w:shd w:fill="FAFAFA" w:val="clear"/>
             <w:tcMar>
-              <w:top w:type="dxa" w:w="60"/>
-              <w:left w:type="dxa" w:w="160"/>
-              <w:bottom w:type="dxa" w:w="60"/>
-              <w:right w:type="dxa" w:w="160"/>
-            </w:tcMar>
-          </w:tcPr>
-          <w:p>
-            <w:r>
-              <w:rPr>
-                <w:sz w:val="22"/>
-                <w:szCs w:val="22"/>
-              </w:rPr>
-              <w:t xml:space="preserve"/>
-            </w:r>
-          </w:p>
-        </w:tc>
-      </w:tr>
-      <w:tr>
-        <w:trPr>
-          <w:trHeight w:val="480"/>
-        </w:trPr>
-        <w:tc>
-          <w:tcPr>
-            <w:tcW w:type="dxa" w:w="9638"/>
-            <w:tcBorders>
-              <w:top w:val="single" w:color="E0E0E0" w:sz="4"/>
-              <w:left w:val="single" w:color="E0E0E0" w:sz="4"/>
-              <w:bottom w:val="single" w:color="E0E0E0" w:sz="4"/>
-              <w:right w:val="single" w:color="E0E0E0" w:sz="4"/>
-            </w:tcBorders>
-            <w:shd w:fill="FAFAFA" w:val="clear"/>
-            <w:tcMar>
-              <w:top w:type="dxa" w:w="60"/>
-              <w:left w:type="dxa" w:w="160"/>
-              <w:bottom w:type="dxa" w:w="60"/>
-              <w:right w:type="dxa" w:w="160"/>
-            </w:tcMar>
-          </w:tcPr>
-          <w:p>
-            <w:r>
-              <w:rPr>
-                <w:sz w:val="22"/>
-                <w:szCs w:val="22"/>
-              </w:rPr>
-              <w:t xml:space="preserve"/>
+              <w:top w:type="dxa" w:w="80"/>
+              <w:left w:type="dxa" w:w="160"/>
+              <w:bottom w:type="dxa" w:w="80"/>
+              <w:right w:type="dxa" w:w="160"/>
+            </w:tcMar>
+          </w:tcPr>
+          <w:p>
+            <w:pPr>
+              <w:jc w:val="center"/>
+            </w:pPr>
+            <w:r>
+              <w:rPr>
+                <w:rFonts w:ascii="Arial" w:cs="Arial" w:eastAsia="Arial" w:hAnsi="Arial"/>
+                <w:i/>
+                <w:iCs/>
+                <w:color w:val="757575"/>
+                <w:sz w:val="20"/>
+                <w:szCs w:val="20"/>
+              </w:rPr>
+              <w:t xml:space="preserve">[Pega aquí la captura de pantalla]</w:t>
             </w:r>
           </w:p>
         </w:tc>
@@ -1376,32 +1394,8 @@
     </w:tbl>
     <w:p>
       <w:pPr>
-        <w:spacing w:after="200"/>
-      </w:pPr>
-    </w:p>
-    <w:p>
-      <w:r>
-        <w:br w:type="page"/>
-      </w:r>
-    </w:p>
-    <w:p>
-      <w:pPr>
-        <w:pBdr>
-          <w:bottom w:val="single" w:color="FFA000" w:sz="4" w:space="1"/>
-        </w:pBdr>
-        <w:spacing w:after="120" w:before="240"/>
-      </w:pPr>
-      <w:r>
-        <w:rPr>
-          <w:rFonts w:ascii="Arial" w:cs="Arial" w:eastAsia="Arial" w:hAnsi="Arial"/>
-          <w:b/>
-          <w:bCs/>
-          <w:color w:val="3949AB"/>
-          <w:sz w:val="24"/>
-          <w:szCs w:val="24"/>
-        </w:rPr>
-        <w:t xml:space="preserve">Reflexiona</w:t>
-      </w:r>
+        <w:spacing w:after="120"/>
+      </w:pPr>
     </w:p>
     <w:p>
       <w:pPr>
@@ -1414,7 +1408,7 @@
           <w:sz w:val="22"/>
           <w:szCs w:val="22"/>
         </w:rPr>
-        <w:t xml:space="preserve">Acabas de publicar un bucket accesible por cualquiera en internet. Si mañana a las tres de la madrugada ese bucket deja de responder, ¿de quién es la responsabilidad — de AWS o tuya? ¿Y si lo que falla es que alguien más ha podido borrar tus ficheros porque la política de acceso era más permisiva de lo necesario? Responde señalando, para cada caso, qué parte exacta de lo que has hecho hoy correspondería a cada lado del reparto.</w:t>
+        <w:t xml:space="preserve">Anota dónde vas a consultar el gasto real de tu laboratorio al terminar cada sesión:</w:t>
       </w:r>
     </w:p>
     <w:tbl>
@@ -1496,134 +1490,6 @@
           </w:p>
         </w:tc>
       </w:tr>
-      <w:tr>
-        <w:trPr>
-          <w:trHeight w:val="480"/>
-        </w:trPr>
-        <w:tc>
-          <w:tcPr>
-            <w:tcW w:type="dxa" w:w="9638"/>
-            <w:tcBorders>
-              <w:top w:val="single" w:color="E0E0E0" w:sz="4"/>
-              <w:left w:val="single" w:color="E0E0E0" w:sz="4"/>
-              <w:bottom w:val="single" w:color="E0E0E0" w:sz="4"/>
-              <w:right w:val="single" w:color="E0E0E0" w:sz="4"/>
-            </w:tcBorders>
-            <w:shd w:fill="FAFAFA" w:val="clear"/>
-            <w:tcMar>
-              <w:top w:type="dxa" w:w="60"/>
-              <w:left w:type="dxa" w:w="160"/>
-              <w:bottom w:type="dxa" w:w="60"/>
-              <w:right w:type="dxa" w:w="160"/>
-            </w:tcMar>
-          </w:tcPr>
-          <w:p>
-            <w:r>
-              <w:rPr>
-                <w:sz w:val="22"/>
-                <w:szCs w:val="22"/>
-              </w:rPr>
-              <w:t xml:space="preserve"/>
-            </w:r>
-          </w:p>
-        </w:tc>
-      </w:tr>
-      <w:tr>
-        <w:trPr>
-          <w:trHeight w:val="480"/>
-        </w:trPr>
-        <w:tc>
-          <w:tcPr>
-            <w:tcW w:type="dxa" w:w="9638"/>
-            <w:tcBorders>
-              <w:top w:val="single" w:color="E0E0E0" w:sz="4"/>
-              <w:left w:val="single" w:color="E0E0E0" w:sz="4"/>
-              <w:bottom w:val="single" w:color="E0E0E0" w:sz="4"/>
-              <w:right w:val="single" w:color="E0E0E0" w:sz="4"/>
-            </w:tcBorders>
-            <w:shd w:fill="FAFAFA" w:val="clear"/>
-            <w:tcMar>
-              <w:top w:type="dxa" w:w="60"/>
-              <w:left w:type="dxa" w:w="160"/>
-              <w:bottom w:type="dxa" w:w="60"/>
-              <w:right w:type="dxa" w:w="160"/>
-            </w:tcMar>
-          </w:tcPr>
-          <w:p>
-            <w:r>
-              <w:rPr>
-                <w:sz w:val="22"/>
-                <w:szCs w:val="22"/>
-              </w:rPr>
-              <w:t xml:space="preserve"/>
-            </w:r>
-          </w:p>
-        </w:tc>
-      </w:tr>
-      <w:tr>
-        <w:trPr>
-          <w:trHeight w:val="480"/>
-        </w:trPr>
-        <w:tc>
-          <w:tcPr>
-            <w:tcW w:type="dxa" w:w="9638"/>
-            <w:tcBorders>
-              <w:top w:val="single" w:color="E0E0E0" w:sz="4"/>
-              <w:left w:val="single" w:color="E0E0E0" w:sz="4"/>
-              <w:bottom w:val="single" w:color="E0E0E0" w:sz="4"/>
-              <w:right w:val="single" w:color="E0E0E0" w:sz="4"/>
-            </w:tcBorders>
-            <w:shd w:fill="FAFAFA" w:val="clear"/>
-            <w:tcMar>
-              <w:top w:type="dxa" w:w="60"/>
-              <w:left w:type="dxa" w:w="160"/>
-              <w:bottom w:type="dxa" w:w="60"/>
-              <w:right w:type="dxa" w:w="160"/>
-            </w:tcMar>
-          </w:tcPr>
-          <w:p>
-            <w:r>
-              <w:rPr>
-                <w:sz w:val="22"/>
-                <w:szCs w:val="22"/>
-              </w:rPr>
-              <w:t xml:space="preserve"/>
-            </w:r>
-          </w:p>
-        </w:tc>
-      </w:tr>
-      <w:tr>
-        <w:trPr>
-          <w:trHeight w:val="480"/>
-        </w:trPr>
-        <w:tc>
-          <w:tcPr>
-            <w:tcW w:type="dxa" w:w="9638"/>
-            <w:tcBorders>
-              <w:top w:val="single" w:color="E0E0E0" w:sz="4"/>
-              <w:left w:val="single" w:color="E0E0E0" w:sz="4"/>
-              <w:bottom w:val="single" w:color="E0E0E0" w:sz="4"/>
-              <w:right w:val="single" w:color="E0E0E0" w:sz="4"/>
-            </w:tcBorders>
-            <w:shd w:fill="FAFAFA" w:val="clear"/>
-            <w:tcMar>
-              <w:top w:type="dxa" w:w="60"/>
-              <w:left w:type="dxa" w:w="160"/>
-              <w:bottom w:type="dxa" w:w="60"/>
-              <w:right w:type="dxa" w:w="160"/>
-            </w:tcMar>
-          </w:tcPr>
-          <w:p>
-            <w:r>
-              <w:rPr>
-                <w:sz w:val="22"/>
-                <w:szCs w:val="22"/>
-              </w:rPr>
-              <w:t xml:space="preserve"/>
-            </w:r>
-          </w:p>
-        </w:tc>
-      </w:tr>
     </w:tbl>
     <w:p>
       <w:pPr>
@@ -1634,29 +1500,6 @@
       <w:r>
         <w:br w:type="page"/>
       </w:r>
-    </w:p>
-    <w:p>
-      <w:pPr>
-        <w:shd w:fill="3949AB" w:val="clear"/>
-        <w:spacing w:after="0" w:before="320"/>
-        <w:ind w:left="200" w:right="200"/>
-      </w:pPr>
-      <w:r>
-        <w:rPr>
-          <w:rFonts w:ascii="Arial" w:cs="Arial" w:eastAsia="Arial" w:hAnsi="Arial"/>
-          <w:b/>
-          <w:bCs/>
-          <w:color w:val="FFFFFF"/>
-          <w:sz w:val="26"/>
-          <w:szCs w:val="26"/>
-        </w:rPr>
-        <w:t xml:space="preserve">Parte B — Reto: automatiza sin receta</w:t>
-      </w:r>
-    </w:p>
-    <w:p>
-      <w:pPr>
-        <w:spacing w:after="120"/>
-      </w:pPr>
     </w:p>
     <w:p>
       <w:pPr>
@@ -1674,7 +1517,21 @@
           <w:sz w:val="24"/>
           <w:szCs w:val="24"/>
         </w:rPr>
-        <w:t xml:space="preserve">Reproduce el despliegue entero por CLI</w:t>
+        <w:t xml:space="preserve">Reflexiona</w:t>
+      </w:r>
+    </w:p>
+    <w:p>
+      <w:pPr>
+        <w:spacing w:after="100"/>
+      </w:pPr>
+      <w:r>
+        <w:rPr>
+          <w:rFonts w:ascii="Arial" w:cs="Arial" w:eastAsia="Arial" w:hAnsi="Arial"/>
+          <w:color w:val="212121"/>
+          <w:sz w:val="22"/>
+          <w:szCs w:val="22"/>
+        </w:rPr>
+        <w:t xml:space="preserve">Acabas de publicar un bucket accesible por cualquiera en internet. Si mañana a las tres de la madrugada ese bucket deja de responder, ¿de quién es la responsabilidad — de AWS o tuya? ¿Y si lo que falla es que alguien más ha podido borrar tus ficheros porque la política de acceso era más permisiva de lo necesario? Responde señalando, para cada caso, qué parte exacta de lo que has hecho hoy correspondería a cada lado del reparto.</w:t>
       </w:r>
     </w:p>
     <w:tbl>
@@ -1693,6 +1550,365 @@
         <w:gridCol w:w="9638"/>
       </w:tblGrid>
       <w:tr>
+        <w:trPr>
+          <w:trHeight w:val="480"/>
+        </w:trPr>
+        <w:tc>
+          <w:tcPr>
+            <w:tcW w:type="dxa" w:w="9638"/>
+            <w:tcBorders>
+              <w:top w:val="single" w:color="E0E0E0" w:sz="4"/>
+              <w:left w:val="single" w:color="E0E0E0" w:sz="4"/>
+              <w:bottom w:val="single" w:color="E0E0E0" w:sz="4"/>
+              <w:right w:val="single" w:color="E0E0E0" w:sz="4"/>
+            </w:tcBorders>
+            <w:shd w:fill="FAFAFA" w:val="clear"/>
+            <w:tcMar>
+              <w:top w:type="dxa" w:w="60"/>
+              <w:left w:type="dxa" w:w="160"/>
+              <w:bottom w:type="dxa" w:w="60"/>
+              <w:right w:type="dxa" w:w="160"/>
+            </w:tcMar>
+          </w:tcPr>
+          <w:p>
+            <w:r>
+              <w:rPr>
+                <w:sz w:val="22"/>
+                <w:szCs w:val="22"/>
+              </w:rPr>
+              <w:t xml:space="preserve"/>
+            </w:r>
+          </w:p>
+        </w:tc>
+      </w:tr>
+      <w:tr>
+        <w:trPr>
+          <w:trHeight w:val="480"/>
+        </w:trPr>
+        <w:tc>
+          <w:tcPr>
+            <w:tcW w:type="dxa" w:w="9638"/>
+            <w:tcBorders>
+              <w:top w:val="single" w:color="E0E0E0" w:sz="4"/>
+              <w:left w:val="single" w:color="E0E0E0" w:sz="4"/>
+              <w:bottom w:val="single" w:color="E0E0E0" w:sz="4"/>
+              <w:right w:val="single" w:color="E0E0E0" w:sz="4"/>
+            </w:tcBorders>
+            <w:shd w:fill="FAFAFA" w:val="clear"/>
+            <w:tcMar>
+              <w:top w:type="dxa" w:w="60"/>
+              <w:left w:type="dxa" w:w="160"/>
+              <w:bottom w:type="dxa" w:w="60"/>
+              <w:right w:type="dxa" w:w="160"/>
+            </w:tcMar>
+          </w:tcPr>
+          <w:p>
+            <w:r>
+              <w:rPr>
+                <w:sz w:val="22"/>
+                <w:szCs w:val="22"/>
+              </w:rPr>
+              <w:t xml:space="preserve"/>
+            </w:r>
+          </w:p>
+        </w:tc>
+      </w:tr>
+      <w:tr>
+        <w:trPr>
+          <w:trHeight w:val="480"/>
+        </w:trPr>
+        <w:tc>
+          <w:tcPr>
+            <w:tcW w:type="dxa" w:w="9638"/>
+            <w:tcBorders>
+              <w:top w:val="single" w:color="E0E0E0" w:sz="4"/>
+              <w:left w:val="single" w:color="E0E0E0" w:sz="4"/>
+              <w:bottom w:val="single" w:color="E0E0E0" w:sz="4"/>
+              <w:right w:val="single" w:color="E0E0E0" w:sz="4"/>
+            </w:tcBorders>
+            <w:shd w:fill="FAFAFA" w:val="clear"/>
+            <w:tcMar>
+              <w:top w:type="dxa" w:w="60"/>
+              <w:left w:type="dxa" w:w="160"/>
+              <w:bottom w:type="dxa" w:w="60"/>
+              <w:right w:type="dxa" w:w="160"/>
+            </w:tcMar>
+          </w:tcPr>
+          <w:p>
+            <w:r>
+              <w:rPr>
+                <w:sz w:val="22"/>
+                <w:szCs w:val="22"/>
+              </w:rPr>
+              <w:t xml:space="preserve"/>
+            </w:r>
+          </w:p>
+        </w:tc>
+      </w:tr>
+      <w:tr>
+        <w:trPr>
+          <w:trHeight w:val="480"/>
+        </w:trPr>
+        <w:tc>
+          <w:tcPr>
+            <w:tcW w:type="dxa" w:w="9638"/>
+            <w:tcBorders>
+              <w:top w:val="single" w:color="E0E0E0" w:sz="4"/>
+              <w:left w:val="single" w:color="E0E0E0" w:sz="4"/>
+              <w:bottom w:val="single" w:color="E0E0E0" w:sz="4"/>
+              <w:right w:val="single" w:color="E0E0E0" w:sz="4"/>
+            </w:tcBorders>
+            <w:shd w:fill="FAFAFA" w:val="clear"/>
+            <w:tcMar>
+              <w:top w:type="dxa" w:w="60"/>
+              <w:left w:type="dxa" w:w="160"/>
+              <w:bottom w:type="dxa" w:w="60"/>
+              <w:right w:type="dxa" w:w="160"/>
+            </w:tcMar>
+          </w:tcPr>
+          <w:p>
+            <w:r>
+              <w:rPr>
+                <w:sz w:val="22"/>
+                <w:szCs w:val="22"/>
+              </w:rPr>
+              <w:t xml:space="preserve"/>
+            </w:r>
+          </w:p>
+        </w:tc>
+      </w:tr>
+      <w:tr>
+        <w:trPr>
+          <w:trHeight w:val="480"/>
+        </w:trPr>
+        <w:tc>
+          <w:tcPr>
+            <w:tcW w:type="dxa" w:w="9638"/>
+            <w:tcBorders>
+              <w:top w:val="single" w:color="E0E0E0" w:sz="4"/>
+              <w:left w:val="single" w:color="E0E0E0" w:sz="4"/>
+              <w:bottom w:val="single" w:color="E0E0E0" w:sz="4"/>
+              <w:right w:val="single" w:color="E0E0E0" w:sz="4"/>
+            </w:tcBorders>
+            <w:shd w:fill="FAFAFA" w:val="clear"/>
+            <w:tcMar>
+              <w:top w:type="dxa" w:w="60"/>
+              <w:left w:type="dxa" w:w="160"/>
+              <w:bottom w:type="dxa" w:w="60"/>
+              <w:right w:type="dxa" w:w="160"/>
+            </w:tcMar>
+          </w:tcPr>
+          <w:p>
+            <w:r>
+              <w:rPr>
+                <w:sz w:val="22"/>
+                <w:szCs w:val="22"/>
+              </w:rPr>
+              <w:t xml:space="preserve"/>
+            </w:r>
+          </w:p>
+        </w:tc>
+      </w:tr>
+      <w:tr>
+        <w:trPr>
+          <w:trHeight w:val="480"/>
+        </w:trPr>
+        <w:tc>
+          <w:tcPr>
+            <w:tcW w:type="dxa" w:w="9638"/>
+            <w:tcBorders>
+              <w:top w:val="single" w:color="E0E0E0" w:sz="4"/>
+              <w:left w:val="single" w:color="E0E0E0" w:sz="4"/>
+              <w:bottom w:val="single" w:color="E0E0E0" w:sz="4"/>
+              <w:right w:val="single" w:color="E0E0E0" w:sz="4"/>
+            </w:tcBorders>
+            <w:shd w:fill="FAFAFA" w:val="clear"/>
+            <w:tcMar>
+              <w:top w:type="dxa" w:w="60"/>
+              <w:left w:type="dxa" w:w="160"/>
+              <w:bottom w:type="dxa" w:w="60"/>
+              <w:right w:type="dxa" w:w="160"/>
+            </w:tcMar>
+          </w:tcPr>
+          <w:p>
+            <w:r>
+              <w:rPr>
+                <w:sz w:val="22"/>
+                <w:szCs w:val="22"/>
+              </w:rPr>
+              <w:t xml:space="preserve"/>
+            </w:r>
+          </w:p>
+        </w:tc>
+      </w:tr>
+    </w:tbl>
+    <w:p>
+      <w:pPr>
+        <w:spacing w:after="200"/>
+      </w:pPr>
+    </w:p>
+    <w:p>
+      <w:r>
+        <w:br w:type="page"/>
+      </w:r>
+    </w:p>
+    <w:p>
+      <w:pPr>
+        <w:shd w:fill="3949AB" w:val="clear"/>
+        <w:spacing w:after="0" w:before="320"/>
+        <w:ind w:left="200" w:right="200"/>
+      </w:pPr>
+      <w:r>
+        <w:rPr>
+          <w:rFonts w:ascii="Arial" w:cs="Arial" w:eastAsia="Arial" w:hAnsi="Arial"/>
+          <w:b/>
+          <w:bCs/>
+          <w:color w:val="FFFFFF"/>
+          <w:sz w:val="26"/>
+          <w:szCs w:val="26"/>
+        </w:rPr>
+        <w:t xml:space="preserve">Parte B — Pon a prueba tu despliegue</w:t>
+      </w:r>
+    </w:p>
+    <w:p>
+      <w:pPr>
+        <w:spacing w:after="120"/>
+      </w:pPr>
+    </w:p>
+    <w:p>
+      <w:pPr>
+        <w:pBdr>
+          <w:bottom w:val="single" w:color="FFA000" w:sz="4" w:space="1"/>
+        </w:pBdr>
+        <w:spacing w:after="120" w:before="240"/>
+      </w:pPr>
+      <w:r>
+        <w:rPr>
+          <w:rFonts w:ascii="Arial" w:cs="Arial" w:eastAsia="Arial" w:hAnsi="Arial"/>
+          <w:b/>
+          <w:bCs/>
+          <w:color w:val="3949AB"/>
+          <w:sz w:val="24"/>
+          <w:szCs w:val="24"/>
+        </w:rPr>
+        <w:t xml:space="preserve">Rompe tu propio despliegue, y repáralo</w:t>
+      </w:r>
+    </w:p>
+    <w:p>
+      <w:pPr>
+        <w:spacing w:after="100"/>
+      </w:pPr>
+      <w:r>
+        <w:rPr>
+          <w:rFonts w:ascii="Arial" w:cs="Arial" w:eastAsia="Arial" w:hAnsi="Arial"/>
+          <w:color w:val="212121"/>
+          <w:sz w:val="22"/>
+          <w:szCs w:val="22"/>
+        </w:rPr>
+        <w:t xml:space="preserve">Anota el error exacto que ves al volver a activar el bloqueo de acceso público (código y mensaje):</w:t>
+      </w:r>
+    </w:p>
+    <w:tbl>
+      <w:tblPr>
+        <w:tblW w:type="dxa" w:w="9638"/>
+        <w:tblBorders>
+          <w:top w:val="single" w:color="auto" w:sz="4"/>
+          <w:left w:val="single" w:color="auto" w:sz="4"/>
+          <w:bottom w:val="single" w:color="auto" w:sz="4"/>
+          <w:right w:val="single" w:color="auto" w:sz="4"/>
+          <w:insideH w:val="single" w:color="auto" w:sz="4"/>
+          <w:insideV w:val="single" w:color="auto" w:sz="4"/>
+        </w:tblBorders>
+      </w:tblPr>
+      <w:tblGrid>
+        <w:gridCol w:w="9638"/>
+      </w:tblGrid>
+      <w:tr>
+        <w:trPr>
+          <w:trHeight w:val="480"/>
+        </w:trPr>
+        <w:tc>
+          <w:tcPr>
+            <w:tcW w:type="dxa" w:w="9638"/>
+            <w:tcBorders>
+              <w:top w:val="single" w:color="E0E0E0" w:sz="4"/>
+              <w:left w:val="single" w:color="E0E0E0" w:sz="4"/>
+              <w:bottom w:val="single" w:color="E0E0E0" w:sz="4"/>
+              <w:right w:val="single" w:color="E0E0E0" w:sz="4"/>
+            </w:tcBorders>
+            <w:shd w:fill="FAFAFA" w:val="clear"/>
+            <w:tcMar>
+              <w:top w:type="dxa" w:w="60"/>
+              <w:left w:type="dxa" w:w="160"/>
+              <w:bottom w:type="dxa" w:w="60"/>
+              <w:right w:type="dxa" w:w="160"/>
+            </w:tcMar>
+          </w:tcPr>
+          <w:p>
+            <w:r>
+              <w:rPr>
+                <w:sz w:val="22"/>
+                <w:szCs w:val="22"/>
+              </w:rPr>
+              <w:t xml:space="preserve"/>
+            </w:r>
+          </w:p>
+        </w:tc>
+      </w:tr>
+      <w:tr>
+        <w:trPr>
+          <w:trHeight w:val="480"/>
+        </w:trPr>
+        <w:tc>
+          <w:tcPr>
+            <w:tcW w:type="dxa" w:w="9638"/>
+            <w:tcBorders>
+              <w:top w:val="single" w:color="E0E0E0" w:sz="4"/>
+              <w:left w:val="single" w:color="E0E0E0" w:sz="4"/>
+              <w:bottom w:val="single" w:color="E0E0E0" w:sz="4"/>
+              <w:right w:val="single" w:color="E0E0E0" w:sz="4"/>
+            </w:tcBorders>
+            <w:shd w:fill="FAFAFA" w:val="clear"/>
+            <w:tcMar>
+              <w:top w:type="dxa" w:w="60"/>
+              <w:left w:type="dxa" w:w="160"/>
+              <w:bottom w:type="dxa" w:w="60"/>
+              <w:right w:type="dxa" w:w="160"/>
+            </w:tcMar>
+          </w:tcPr>
+          <w:p>
+            <w:r>
+              <w:rPr>
+                <w:sz w:val="22"/>
+                <w:szCs w:val="22"/>
+              </w:rPr>
+              <w:t xml:space="preserve"/>
+            </w:r>
+          </w:p>
+        </w:tc>
+      </w:tr>
+    </w:tbl>
+    <w:p>
+      <w:pPr>
+        <w:spacing w:after="120"/>
+      </w:pPr>
+    </w:p>
+    <w:tbl>
+      <w:tblPr>
+        <w:tblW w:type="dxa" w:w="9638"/>
+        <w:tblBorders>
+          <w:top w:val="single" w:color="auto" w:sz="4"/>
+          <w:left w:val="single" w:color="auto" w:sz="4"/>
+          <w:bottom w:val="single" w:color="auto" w:sz="4"/>
+          <w:right w:val="single" w:color="auto" w:sz="4"/>
+          <w:insideH w:val="single" w:color="auto" w:sz="4"/>
+          <w:insideV w:val="single" w:color="auto" w:sz="4"/>
+        </w:tblBorders>
+      </w:tblPr>
+      <w:tblGrid>
+        <w:gridCol w:w="9638"/>
+      </w:tblGrid>
+      <w:tr>
         <w:tc>
           <w:tcPr>
             <w:tcW w:type="dxa" w:w="9638"/>
@@ -1720,7 +1936,212 @@
                 <w:sz w:val="20"/>
                 <w:szCs w:val="20"/>
               </w:rPr>
-              <w:t xml:space="preserve">📸 Script completo de despliegue y su commit en el repositorio</w:t>
+              <w:t xml:space="preserve">📸 El error real al bloquear el acceso público</w:t>
+            </w:r>
+          </w:p>
+        </w:tc>
+      </w:tr>
+      <w:tr>
+        <w:trPr>
+          <w:trHeight w:val="2400"/>
+        </w:trPr>
+        <w:tc>
+          <w:tcPr>
+            <w:tcW w:type="dxa" w:w="9638"/>
+            <w:tcBorders>
+              <w:top w:val="single" w:color="E0E0E0" w:sz="4"/>
+              <w:left w:val="single" w:color="E0E0E0" w:sz="4"/>
+              <w:bottom w:val="single" w:color="E0E0E0" w:sz="4"/>
+              <w:right w:val="single" w:color="E0E0E0" w:sz="4"/>
+            </w:tcBorders>
+            <w:shd w:fill="FAFAFA" w:val="clear"/>
+            <w:tcMar>
+              <w:top w:type="dxa" w:w="80"/>
+              <w:left w:type="dxa" w:w="160"/>
+              <w:bottom w:type="dxa" w:w="80"/>
+              <w:right w:type="dxa" w:w="160"/>
+            </w:tcMar>
+          </w:tcPr>
+          <w:p>
+            <w:pPr>
+              <w:jc w:val="center"/>
+            </w:pPr>
+            <w:r>
+              <w:rPr>
+                <w:rFonts w:ascii="Arial" w:cs="Arial" w:eastAsia="Arial" w:hAnsi="Arial"/>
+                <w:i/>
+                <w:iCs/>
+                <w:color w:val="757575"/>
+                <w:sz w:val="20"/>
+                <w:szCs w:val="20"/>
+              </w:rPr>
+              <w:t xml:space="preserve">[Pega aquí la captura de pantalla]</w:t>
+            </w:r>
+          </w:p>
+        </w:tc>
+      </w:tr>
+    </w:tbl>
+    <w:p>
+      <w:pPr>
+        <w:spacing w:after="120"/>
+      </w:pPr>
+    </w:p>
+    <w:tbl>
+      <w:tblPr>
+        <w:tblW w:type="dxa" w:w="9638"/>
+        <w:tblBorders>
+          <w:top w:val="single" w:color="auto" w:sz="4"/>
+          <w:left w:val="single" w:color="auto" w:sz="4"/>
+          <w:bottom w:val="single" w:color="auto" w:sz="4"/>
+          <w:right w:val="single" w:color="auto" w:sz="4"/>
+          <w:insideH w:val="single" w:color="auto" w:sz="4"/>
+          <w:insideV w:val="single" w:color="auto" w:sz="4"/>
+        </w:tblBorders>
+      </w:tblPr>
+      <w:tblGrid>
+        <w:gridCol w:w="9638"/>
+      </w:tblGrid>
+      <w:tr>
+        <w:tc>
+          <w:tcPr>
+            <w:tcW w:type="dxa" w:w="9638"/>
+            <w:tcBorders>
+              <w:top w:val="none" w:color="FFFFFF" w:sz="0"/>
+              <w:left w:val="none" w:color="FFFFFF" w:sz="0"/>
+              <w:bottom w:val="none" w:color="FFFFFF" w:sz="0"/>
+              <w:right w:val="none" w:color="FFFFFF" w:sz="0"/>
+            </w:tcBorders>
+            <w:shd w:fill="3949AB" w:val="clear"/>
+            <w:tcMar>
+              <w:top w:type="dxa" w:w="80"/>
+              <w:left w:type="dxa" w:w="160"/>
+              <w:bottom w:type="dxa" w:w="80"/>
+              <w:right w:type="dxa" w:w="160"/>
+            </w:tcMar>
+          </w:tcPr>
+          <w:p>
+            <w:r>
+              <w:rPr>
+                <w:rFonts w:ascii="Arial" w:cs="Arial" w:eastAsia="Arial" w:hAnsi="Arial"/>
+                <w:b/>
+                <w:bCs/>
+                <w:color w:val="FFFFFF"/>
+                <w:sz w:val="20"/>
+                <w:szCs w:val="20"/>
+              </w:rPr>
+              <w:t xml:space="preserve">📸 El sitio funcionando de nuevo, tras reparar el bucket</w:t>
+            </w:r>
+          </w:p>
+        </w:tc>
+      </w:tr>
+      <w:tr>
+        <w:trPr>
+          <w:trHeight w:val="2400"/>
+        </w:trPr>
+        <w:tc>
+          <w:tcPr>
+            <w:tcW w:type="dxa" w:w="9638"/>
+            <w:tcBorders>
+              <w:top w:val="single" w:color="E0E0E0" w:sz="4"/>
+              <w:left w:val="single" w:color="E0E0E0" w:sz="4"/>
+              <w:bottom w:val="single" w:color="E0E0E0" w:sz="4"/>
+              <w:right w:val="single" w:color="E0E0E0" w:sz="4"/>
+            </w:tcBorders>
+            <w:shd w:fill="FAFAFA" w:val="clear"/>
+            <w:tcMar>
+              <w:top w:type="dxa" w:w="80"/>
+              <w:left w:type="dxa" w:w="160"/>
+              <w:bottom w:type="dxa" w:w="80"/>
+              <w:right w:type="dxa" w:w="160"/>
+            </w:tcMar>
+          </w:tcPr>
+          <w:p>
+            <w:pPr>
+              <w:jc w:val="center"/>
+            </w:pPr>
+            <w:r>
+              <w:rPr>
+                <w:rFonts w:ascii="Arial" w:cs="Arial" w:eastAsia="Arial" w:hAnsi="Arial"/>
+                <w:i/>
+                <w:iCs/>
+                <w:color w:val="757575"/>
+                <w:sz w:val="20"/>
+                <w:szCs w:val="20"/>
+              </w:rPr>
+              <w:t xml:space="preserve">[Pega aquí la captura de pantalla]</w:t>
+            </w:r>
+          </w:p>
+        </w:tc>
+      </w:tr>
+    </w:tbl>
+    <w:p>
+      <w:pPr>
+        <w:spacing w:after="160"/>
+      </w:pPr>
+    </w:p>
+    <w:p>
+      <w:pPr>
+        <w:pBdr>
+          <w:bottom w:val="single" w:color="FFA000" w:sz="4" w:space="1"/>
+        </w:pBdr>
+        <w:spacing w:after="120" w:before="240"/>
+      </w:pPr>
+      <w:r>
+        <w:rPr>
+          <w:rFonts w:ascii="Arial" w:cs="Arial" w:eastAsia="Arial" w:hAnsi="Arial"/>
+          <w:b/>
+          <w:bCs/>
+          <w:color w:val="3949AB"/>
+          <w:sz w:val="24"/>
+          <w:szCs w:val="24"/>
+        </w:rPr>
+        <w:t xml:space="preserve">Calcula cuánto cuesta mantenerlo un año entero</w:t>
+      </w:r>
+    </w:p>
+    <w:tbl>
+      <w:tblPr>
+        <w:tblW w:type="dxa" w:w="9638"/>
+        <w:tblBorders>
+          <w:top w:val="single" w:color="auto" w:sz="4"/>
+          <w:left w:val="single" w:color="auto" w:sz="4"/>
+          <w:bottom w:val="single" w:color="auto" w:sz="4"/>
+          <w:right w:val="single" w:color="auto" w:sz="4"/>
+          <w:insideH w:val="single" w:color="auto" w:sz="4"/>
+          <w:insideV w:val="single" w:color="auto" w:sz="4"/>
+        </w:tblBorders>
+      </w:tblPr>
+      <w:tblGrid>
+        <w:gridCol w:w="9638"/>
+      </w:tblGrid>
+      <w:tr>
+        <w:tc>
+          <w:tcPr>
+            <w:tcW w:type="dxa" w:w="9638"/>
+            <w:tcBorders>
+              <w:top w:val="none" w:color="FFFFFF" w:sz="0"/>
+              <w:left w:val="none" w:color="FFFFFF" w:sz="0"/>
+              <w:bottom w:val="none" w:color="FFFFFF" w:sz="0"/>
+              <w:right w:val="none" w:color="FFFFFF" w:sz="0"/>
+            </w:tcBorders>
+            <w:shd w:fill="3949AB" w:val="clear"/>
+            <w:tcMar>
+              <w:top w:type="dxa" w:w="80"/>
+              <w:left w:type="dxa" w:w="160"/>
+              <w:bottom w:type="dxa" w:w="80"/>
+              <w:right w:type="dxa" w:w="160"/>
+            </w:tcMar>
+          </w:tcPr>
+          <w:p>
+            <w:r>
+              <w:rPr>
+                <w:rFonts w:ascii="Arial" w:cs="Arial" w:eastAsia="Arial" w:hAnsi="Arial"/>
+                <w:b/>
+                <w:bCs/>
+                <w:color w:val="FFFFFF"/>
+                <w:sz w:val="20"/>
+                <w:szCs w:val="20"/>
+              </w:rPr>
+              <w:t xml:space="preserve">📸 Desglose de coste mensual y anual de la calculadora (almacenamiento y transferencia por separado)</w:t>
             </w:r>
           </w:p>
         </w:tc>

</xml_diff>